<commit_message>
[Update] D1 and Templates
</commit_message>
<xml_diff>
--- a/provided-docs/[NEW] COMP2300 Coursework Specification-draft2.docx
+++ b/provided-docs/[NEW] COMP2300 Coursework Specification-draft2.docx
@@ -207,7 +207,6 @@
               <w:bottom w:val="single" w:sz="6" w:space="0" w:color="auto"/>
               <w:right w:val="single" w:sz="6" w:space="0" w:color="auto"/>
             </w:tcBorders>
-            <w:shd w:val="clear" w:color="auto" w:fill="auto"/>
             <w:hideMark/>
           </w:tcPr>
           <w:p>
@@ -299,7 +298,6 @@
               <w:bottom w:val="single" w:sz="6" w:space="0" w:color="auto"/>
               <w:right w:val="single" w:sz="6" w:space="0" w:color="auto"/>
             </w:tcBorders>
-            <w:shd w:val="clear" w:color="auto" w:fill="auto"/>
             <w:hideMark/>
           </w:tcPr>
           <w:p>
@@ -382,7 +380,6 @@
               <w:bottom w:val="single" w:sz="6" w:space="0" w:color="auto"/>
               <w:right w:val="single" w:sz="6" w:space="0" w:color="auto"/>
             </w:tcBorders>
-            <w:shd w:val="clear" w:color="auto" w:fill="auto"/>
             <w:hideMark/>
           </w:tcPr>
           <w:p>
@@ -484,7 +481,6 @@
               <w:bottom w:val="single" w:sz="6" w:space="0" w:color="auto"/>
               <w:right w:val="single" w:sz="6" w:space="0" w:color="auto"/>
             </w:tcBorders>
-            <w:shd w:val="clear" w:color="auto" w:fill="auto"/>
             <w:hideMark/>
           </w:tcPr>
           <w:p>
@@ -588,7 +584,6 @@
               <w:bottom w:val="single" w:sz="6" w:space="0" w:color="auto"/>
               <w:right w:val="single" w:sz="6" w:space="0" w:color="auto"/>
             </w:tcBorders>
-            <w:shd w:val="clear" w:color="auto" w:fill="auto"/>
             <w:hideMark/>
           </w:tcPr>
           <w:p>
@@ -689,7 +684,6 @@
               <w:bottom w:val="single" w:sz="6" w:space="0" w:color="auto"/>
               <w:right w:val="single" w:sz="6" w:space="0" w:color="auto"/>
             </w:tcBorders>
-            <w:shd w:val="clear" w:color="auto" w:fill="auto"/>
             <w:hideMark/>
           </w:tcPr>
           <w:p>
@@ -790,7 +784,6 @@
               <w:bottom w:val="single" w:sz="6" w:space="0" w:color="auto"/>
               <w:right w:val="single" w:sz="6" w:space="0" w:color="auto"/>
             </w:tcBorders>
-            <w:shd w:val="clear" w:color="auto" w:fill="auto"/>
             <w:hideMark/>
           </w:tcPr>
           <w:p>
@@ -829,7 +822,6 @@
               <w:bottom w:val="single" w:sz="6" w:space="0" w:color="auto"/>
               <w:right w:val="single" w:sz="6" w:space="0" w:color="auto"/>
             </w:tcBorders>
-            <w:shd w:val="clear" w:color="auto" w:fill="auto"/>
             <w:hideMark/>
           </w:tcPr>
           <w:p>
@@ -895,7 +887,6 @@
                     <w:bottom w:val="single" w:sz="6" w:space="0" w:color="auto"/>
                     <w:right w:val="single" w:sz="6" w:space="0" w:color="auto"/>
                   </w:tcBorders>
-                  <w:shd w:val="clear" w:color="auto" w:fill="auto"/>
                   <w:hideMark/>
                 </w:tcPr>
                 <w:p>
@@ -986,7 +977,6 @@
                     <w:bottom w:val="single" w:sz="6" w:space="0" w:color="auto"/>
                     <w:right w:val="single" w:sz="6" w:space="0" w:color="auto"/>
                   </w:tcBorders>
-                  <w:shd w:val="clear" w:color="auto" w:fill="auto"/>
                   <w:hideMark/>
                 </w:tcPr>
                 <w:p>
@@ -1203,7 +1193,6 @@
                     <w:bottom w:val="single" w:sz="6" w:space="0" w:color="auto"/>
                     <w:right w:val="single" w:sz="6" w:space="0" w:color="auto"/>
                   </w:tcBorders>
-                  <w:shd w:val="clear" w:color="auto" w:fill="auto"/>
                   <w:hideMark/>
                 </w:tcPr>
                 <w:p>
@@ -1294,7 +1283,6 @@
                     <w:bottom w:val="single" w:sz="6" w:space="0" w:color="auto"/>
                     <w:right w:val="single" w:sz="6" w:space="0" w:color="auto"/>
                   </w:tcBorders>
-                  <w:shd w:val="clear" w:color="auto" w:fill="auto"/>
                   <w:hideMark/>
                 </w:tcPr>
                 <w:p>
@@ -1379,7 +1367,6 @@
                     <w:bottom w:val="single" w:sz="6" w:space="0" w:color="auto"/>
                     <w:right w:val="single" w:sz="6" w:space="0" w:color="auto"/>
                   </w:tcBorders>
-                  <w:shd w:val="clear" w:color="auto" w:fill="auto"/>
                   <w:hideMark/>
                 </w:tcPr>
                 <w:p>
@@ -1450,7 +1437,6 @@
                     <w:bottom w:val="single" w:sz="6" w:space="0" w:color="auto"/>
                     <w:right w:val="single" w:sz="6" w:space="0" w:color="auto"/>
                   </w:tcBorders>
-                  <w:shd w:val="clear" w:color="auto" w:fill="auto"/>
                   <w:hideMark/>
                 </w:tcPr>
                 <w:p>
@@ -2872,21 +2858,8 @@
           <w:lang w:val="en-MY" w:eastAsia="en-GB"/>
           <w14:ligatures w14:val="none"/>
         </w:rPr>
-        <w:t xml:space="preserve">Use of </w:t>
-      </w:r>
-      <w:proofErr w:type="spellStart"/>
-      <w:r>
-        <w:rPr>
-          <w:rFonts w:ascii="Times New Roman" w:eastAsia="Times New Roman" w:hAnsi="Times New Roman" w:cs="Times New Roman"/>
-          <w:b/>
-          <w:bCs/>
-          <w:kern w:val="0"/>
-          <w:lang w:val="en-MY" w:eastAsia="en-GB"/>
-          <w14:ligatures w14:val="none"/>
-        </w:rPr>
-        <w:t>GenAI</w:t>
-      </w:r>
-      <w:proofErr w:type="spellEnd"/>
+        <w:t>Use of GenAI</w:t>
+      </w:r>
     </w:p>
     <w:p>
       <w:pPr>
@@ -5122,24 +5095,8 @@
           <w:lang w:val="en-MY" w:eastAsia="en-GB"/>
           <w14:ligatures w14:val="none"/>
         </w:rPr>
-        <w:t xml:space="preserve">Use of </w:t>
-      </w:r>
-      <w:proofErr w:type="spellStart"/>
-      <w:r>
-        <w:rPr>
-          <w:rFonts w:ascii="Arial" w:eastAsia="Times New Roman" w:hAnsi="Arial" w:cs="Arial"/>
-          <w:b/>
-          <w:bCs/>
-          <w:color w:val="000000"/>
-          <w:kern w:val="0"/>
-          <w:sz w:val="53"/>
-          <w:szCs w:val="53"/>
-          <w:lang w:val="en-MY" w:eastAsia="en-GB"/>
-          <w14:ligatures w14:val="none"/>
-        </w:rPr>
-        <w:t>GenAI</w:t>
-      </w:r>
-      <w:proofErr w:type="spellEnd"/>
+        <w:t>Use of GenAI</w:t>
+      </w:r>
     </w:p>
     <w:p>
       <w:pPr>
@@ -5240,33 +5197,7 @@
           <w:lang w:val="en-MY" w:eastAsia="en-GB"/>
           <w14:ligatures w14:val="none"/>
         </w:rPr>
-        <w:t xml:space="preserve">, which describes how it was used; including the names and versions of the tool, and the purposes for which you used it. Failure to disclose the use of </w:t>
-      </w:r>
-      <w:proofErr w:type="spellStart"/>
-      <w:r>
-        <w:rPr>
-          <w:rFonts w:ascii="Arial" w:eastAsia="Times New Roman" w:hAnsi="Arial" w:cs="Arial"/>
-          <w:color w:val="000000"/>
-          <w:kern w:val="0"/>
-          <w:sz w:val="21"/>
-          <w:szCs w:val="21"/>
-          <w:lang w:val="en-MY" w:eastAsia="en-GB"/>
-          <w14:ligatures w14:val="none"/>
-        </w:rPr>
-        <w:t>GenAI</w:t>
-      </w:r>
-      <w:proofErr w:type="spellEnd"/>
-      <w:r>
-        <w:rPr>
-          <w:rFonts w:ascii="Arial" w:eastAsia="Times New Roman" w:hAnsi="Arial" w:cs="Arial"/>
-          <w:color w:val="000000"/>
-          <w:kern w:val="0"/>
-          <w:sz w:val="21"/>
-          <w:szCs w:val="21"/>
-          <w:lang w:val="en-MY" w:eastAsia="en-GB"/>
-          <w14:ligatures w14:val="none"/>
-        </w:rPr>
-        <w:t xml:space="preserve"> is a breach of the Academic Responsibility and Conduct Regulations.</w:t>
+        <w:t>, which describes how it was used; including the names and versions of the tool, and the purposes for which you used it. Failure to disclose the use of GenAI is a breach of the Academic Responsibility and Conduct Regulations.</w:t>
       </w:r>
     </w:p>
     <w:p>
@@ -5305,33 +5236,7 @@
           <w:lang w:val="en-MY" w:eastAsia="en-GB"/>
           <w14:ligatures w14:val="none"/>
         </w:rPr>
-        <w:t xml:space="preserve"> You should be aware that Generative AI tools produce low-quality, imprecise, and superficial output, which does not meet our expectations for degree-level work. To obtain a high mark, you must check, edit and improve any </w:t>
-      </w:r>
-      <w:proofErr w:type="spellStart"/>
-      <w:r>
-        <w:rPr>
-          <w:rFonts w:ascii="Arial" w:eastAsia="Times New Roman" w:hAnsi="Arial" w:cs="Arial"/>
-          <w:color w:val="000000"/>
-          <w:kern w:val="0"/>
-          <w:sz w:val="21"/>
-          <w:szCs w:val="21"/>
-          <w:lang w:val="en-MY" w:eastAsia="en-GB"/>
-          <w14:ligatures w14:val="none"/>
-        </w:rPr>
-        <w:t>GenAI</w:t>
-      </w:r>
-      <w:proofErr w:type="spellEnd"/>
-      <w:r>
-        <w:rPr>
-          <w:rFonts w:ascii="Arial" w:eastAsia="Times New Roman" w:hAnsi="Arial" w:cs="Arial"/>
-          <w:color w:val="000000"/>
-          <w:kern w:val="0"/>
-          <w:sz w:val="21"/>
-          <w:szCs w:val="21"/>
-          <w:lang w:val="en-MY" w:eastAsia="en-GB"/>
-          <w14:ligatures w14:val="none"/>
-        </w:rPr>
-        <w:t xml:space="preserve"> output that you use based on your own knowledge, understanding, and insight.</w:t>
+        <w:t xml:space="preserve"> You should be aware that Generative AI tools produce low-quality, imprecise, and superficial output, which does not meet our expectations for degree-level work. To obtain a high mark, you must check, edit and improve any GenAI output that you use based on your own knowledge, understanding, and insight.</w:t>
       </w:r>
     </w:p>
     <w:p>
@@ -6125,33 +6030,7 @@
           <w:lang w:val="en-MY" w:eastAsia="en-GB"/>
           <w14:ligatures w14:val="none"/>
         </w:rPr>
-        <w:t xml:space="preserve">Michael K. </w:t>
-      </w:r>
-      <w:proofErr w:type="spellStart"/>
-      <w:r>
-        <w:rPr>
-          <w:rFonts w:ascii="Arial" w:eastAsia="Times New Roman" w:hAnsi="Arial" w:cs="Arial"/>
-          <w:color w:val="000000"/>
-          <w:kern w:val="0"/>
-          <w:sz w:val="21"/>
-          <w:szCs w:val="21"/>
-          <w:lang w:val="en-MY" w:eastAsia="en-GB"/>
-          <w14:ligatures w14:val="none"/>
-        </w:rPr>
-        <w:t>Svangren</w:t>
-      </w:r>
-      <w:proofErr w:type="spellEnd"/>
-      <w:r>
-        <w:rPr>
-          <w:rFonts w:ascii="Arial" w:eastAsia="Times New Roman" w:hAnsi="Arial" w:cs="Arial"/>
-          <w:color w:val="000000"/>
-          <w:kern w:val="0"/>
-          <w:sz w:val="21"/>
-          <w:szCs w:val="21"/>
-          <w:lang w:val="en-MY" w:eastAsia="en-GB"/>
-          <w14:ligatures w14:val="none"/>
-        </w:rPr>
-        <w:t xml:space="preserve"> et al. 2018. Driving on sunshine: aligning electric vehicle charging and household electricity production. </w:t>
+        <w:t xml:space="preserve">Michael K. Svangren et al. 2018. Driving on sunshine: aligning electric vehicle charging and household electricity production. </w:t>
       </w:r>
       <w:proofErr w:type="spellStart"/>
       <w:r>
@@ -6223,33 +6102,7 @@
           <w:lang w:val="en-MY" w:eastAsia="en-GB"/>
           <w14:ligatures w14:val="none"/>
         </w:rPr>
-        <w:t xml:space="preserve">Jesper </w:t>
-      </w:r>
-      <w:proofErr w:type="spellStart"/>
-      <w:r>
-        <w:rPr>
-          <w:rFonts w:ascii="Arial" w:eastAsia="Times New Roman" w:hAnsi="Arial" w:cs="Arial"/>
-          <w:color w:val="000000"/>
-          <w:kern w:val="0"/>
-          <w:sz w:val="21"/>
-          <w:szCs w:val="21"/>
-          <w:lang w:val="en-MY" w:eastAsia="en-GB"/>
-          <w14:ligatures w14:val="none"/>
-        </w:rPr>
-        <w:t>Kjeldskov</w:t>
-      </w:r>
-      <w:proofErr w:type="spellEnd"/>
-      <w:r>
-        <w:rPr>
-          <w:rFonts w:ascii="Arial" w:eastAsia="Times New Roman" w:hAnsi="Arial" w:cs="Arial"/>
-          <w:color w:val="000000"/>
-          <w:kern w:val="0"/>
-          <w:sz w:val="21"/>
-          <w:szCs w:val="21"/>
-          <w:lang w:val="en-MY" w:eastAsia="en-GB"/>
-          <w14:ligatures w14:val="none"/>
-        </w:rPr>
-        <w:t xml:space="preserve"> et al. 2015. Eco-Forecasting for Domestic Electricity Use. CHI '15. </w:t>
+        <w:t>Jesper Kjeldskov et al. 2015. Eco-Forecasting for Domestic Electricity Use. CHI '15. </w:t>
       </w:r>
       <w:hyperlink r:id="rId6" w:history="1">
         <w:r>
@@ -7216,33 +7069,7 @@
           <w:lang w:val="en-MY" w:eastAsia="en-GB"/>
           <w14:ligatures w14:val="none"/>
         </w:rPr>
-        <w:t xml:space="preserve">2. M. Khandelwal, ‘Students’ Attitude toward Carbon Footprints of a Leading Private University in India’, </w:t>
-      </w:r>
-      <w:proofErr w:type="spellStart"/>
-      <w:r>
-        <w:rPr>
-          <w:rFonts w:ascii="Arial" w:eastAsia="Times New Roman" w:hAnsi="Arial" w:cs="Arial"/>
-          <w:color w:val="000000"/>
-          <w:kern w:val="0"/>
-          <w:sz w:val="21"/>
-          <w:szCs w:val="21"/>
-          <w:lang w:val="en-MY" w:eastAsia="en-GB"/>
-          <w14:ligatures w14:val="none"/>
-        </w:rPr>
-        <w:t>Manag</w:t>
-      </w:r>
-      <w:proofErr w:type="spellEnd"/>
-      <w:r>
-        <w:rPr>
-          <w:rFonts w:ascii="Arial" w:eastAsia="Times New Roman" w:hAnsi="Arial" w:cs="Arial"/>
-          <w:color w:val="000000"/>
-          <w:kern w:val="0"/>
-          <w:sz w:val="21"/>
-          <w:szCs w:val="21"/>
-          <w:lang w:val="en-MY" w:eastAsia="en-GB"/>
-          <w14:ligatures w14:val="none"/>
-        </w:rPr>
-        <w:t xml:space="preserve"> Econ Res J, vol. 5, no. 2019, p. 7606, 2019. </w:t>
+        <w:t xml:space="preserve">2. M. Khandelwal, ‘Students’ Attitude toward Carbon Footprints of a Leading Private University in India’, Manag Econ Res J, vol. 5, no. 2019, p. 7606, 2019. </w:t>
       </w:r>
     </w:p>
     <w:p>
@@ -7269,33 +7096,7 @@
           <w:lang w:val="en-MY" w:eastAsia="en-GB"/>
           <w14:ligatures w14:val="none"/>
         </w:rPr>
-        <w:t xml:space="preserve">3. M. Lim and G. </w:t>
-      </w:r>
-      <w:proofErr w:type="spellStart"/>
-      <w:r>
-        <w:rPr>
-          <w:rFonts w:ascii="Arial" w:eastAsia="Times New Roman" w:hAnsi="Arial" w:cs="Arial"/>
-          <w:color w:val="000000"/>
-          <w:kern w:val="0"/>
-          <w:sz w:val="21"/>
-          <w:szCs w:val="21"/>
-          <w:lang w:val="en-MY" w:eastAsia="en-GB"/>
-          <w14:ligatures w14:val="none"/>
-        </w:rPr>
-        <w:t>Hayder</w:t>
-      </w:r>
-      <w:proofErr w:type="spellEnd"/>
-      <w:r>
-        <w:rPr>
-          <w:rFonts w:ascii="Arial" w:eastAsia="Times New Roman" w:hAnsi="Arial" w:cs="Arial"/>
-          <w:color w:val="000000"/>
-          <w:kern w:val="0"/>
-          <w:sz w:val="21"/>
-          <w:szCs w:val="21"/>
-          <w:lang w:val="en-MY" w:eastAsia="en-GB"/>
-          <w14:ligatures w14:val="none"/>
-        </w:rPr>
-        <w:t xml:space="preserve">, ‘Performance and reduction of carbon footprint for a sustainable campus’, 2019. </w:t>
+        <w:t xml:space="preserve">3. M. Lim and G. Hayder, ‘Performance and reduction of carbon footprint for a sustainable campus’, 2019. </w:t>
       </w:r>
     </w:p>
     <w:p>
@@ -7401,33 +7202,7 @@
           <w:lang w:val="en-MY" w:eastAsia="en-GB"/>
           <w14:ligatures w14:val="none"/>
         </w:rPr>
-        <w:t xml:space="preserve">, S. Kojima, V. </w:t>
-      </w:r>
-      <w:proofErr w:type="spellStart"/>
-      <w:r>
-        <w:rPr>
-          <w:rFonts w:ascii="Arial" w:eastAsia="Times New Roman" w:hAnsi="Arial" w:cs="Arial"/>
-          <w:color w:val="000000"/>
-          <w:kern w:val="0"/>
-          <w:sz w:val="21"/>
-          <w:szCs w:val="21"/>
-          <w:lang w:val="en-MY" w:eastAsia="en-GB"/>
-          <w14:ligatures w14:val="none"/>
-        </w:rPr>
-        <w:t>Toivio</w:t>
-      </w:r>
-      <w:proofErr w:type="spellEnd"/>
-      <w:r>
-        <w:rPr>
-          <w:rFonts w:ascii="Arial" w:eastAsia="Times New Roman" w:hAnsi="Arial" w:cs="Arial"/>
-          <w:color w:val="000000"/>
-          <w:kern w:val="0"/>
-          <w:sz w:val="21"/>
-          <w:szCs w:val="21"/>
-          <w:lang w:val="en-MY" w:eastAsia="en-GB"/>
-          <w14:ligatures w14:val="none"/>
-        </w:rPr>
-        <w:t xml:space="preserve">, A. </w:t>
+        <w:t xml:space="preserve">, S. Kojima, V. Toivio, A. </w:t>
       </w:r>
       <w:proofErr w:type="spellStart"/>
       <w:r>
@@ -41895,6 +41670,7 @@
   <w:style w:type="character" w:default="1" w:styleId="DefaultParagraphFont">
     <w:name w:val="Default Paragraph Font"/>
     <w:uiPriority w:val="1"/>
+    <w:semiHidden/>
     <w:unhideWhenUsed/>
   </w:style>
   <w:style w:type="table" w:default="1" w:styleId="TableNormal">

</xml_diff>